<commit_message>
Changed Key Pair name from tfvars and updated the doc file
</commit_message>
<xml_diff>
--- a/Lab-Deploy-Apache-EC2-Terraform.docx
+++ b/Lab-Deploy-Apache-EC2-Terraform.docx
@@ -7,6 +7,7 @@
         <w:spacing w:before="1440" w:after="240"/>
         <w:jc w:val="center"/>
       </w:pPr>
+      <w:proofErr w:type="gramStart"/>
       <w:r>
         <w:rPr>
           <w:b/>
@@ -15,7 +16,28 @@
           <w:sz w:val="56"/>
           <w:szCs w:val="56"/>
         </w:rPr>
-        <w:t>🚀  Deploy Apache on EC2</w:t>
+        <w:t>🚀</w:t>
+      </w:r>
+      <w:r>
+        <w:rPr>
+          <w:b/>
+          <w:bCs/>
+          <w:color w:val="0D1117"/>
+          <w:sz w:val="56"/>
+          <w:szCs w:val="56"/>
+        </w:rPr>
+        <w:t xml:space="preserve">  Deploy</w:t>
+      </w:r>
+      <w:proofErr w:type="gramEnd"/>
+      <w:r>
+        <w:rPr>
+          <w:b/>
+          <w:bCs/>
+          <w:color w:val="0D1117"/>
+          <w:sz w:val="56"/>
+          <w:szCs w:val="56"/>
+        </w:rPr>
+        <w:t xml:space="preserve"> Apache on EC2</w:t>
       </w:r>
     </w:p>
     <w:p>
@@ -209,13 +231,23 @@
             </w:tcMar>
           </w:tcPr>
           <w:p>
-            <w:r>
-              <w:rPr>
-                <w:color w:val="24292F"/>
-                <w:sz w:val="20"/>
-                <w:szCs w:val="20"/>
-              </w:rPr>
-              <w:t>IaC Tool</w:t>
+            <w:proofErr w:type="spellStart"/>
+            <w:r>
+              <w:rPr>
+                <w:color w:val="24292F"/>
+                <w:sz w:val="20"/>
+                <w:szCs w:val="20"/>
+              </w:rPr>
+              <w:t>IaC</w:t>
+            </w:r>
+            <w:proofErr w:type="spellEnd"/>
+            <w:r>
+              <w:rPr>
+                <w:color w:val="24292F"/>
+                <w:sz w:val="20"/>
+                <w:szCs w:val="20"/>
+              </w:rPr>
+              <w:t xml:space="preserve"> Tool</w:t>
             </w:r>
           </w:p>
         </w:tc>
@@ -410,7 +442,25 @@
                 <w:sz w:val="20"/>
                 <w:szCs w:val="20"/>
               </w:rPr>
-              <w:t>t2.micro (Free Tier eligible)</w:t>
+              <w:t>t</w:t>
+            </w:r>
+            <w:proofErr w:type="gramStart"/>
+            <w:r>
+              <w:rPr>
+                <w:color w:val="24292F"/>
+                <w:sz w:val="20"/>
+                <w:szCs w:val="20"/>
+              </w:rPr>
+              <w:t>2.micro</w:t>
+            </w:r>
+            <w:proofErr w:type="gramEnd"/>
+            <w:r>
+              <w:rPr>
+                <w:color w:val="24292F"/>
+                <w:sz w:val="20"/>
+                <w:szCs w:val="20"/>
+              </w:rPr>
+              <w:t xml:space="preserve"> (Free Tier eligible)</w:t>
             </w:r>
           </w:p>
         </w:tc>
@@ -460,6 +510,7 @@
             </w:tcMar>
           </w:tcPr>
           <w:p>
+            <w:proofErr w:type="spellStart"/>
             <w:r>
               <w:rPr>
                 <w:color w:val="24292F"/>
@@ -468,6 +519,7 @@
               </w:rPr>
               <w:t>Myfirstwebserver</w:t>
             </w:r>
+            <w:proofErr w:type="spellEnd"/>
           </w:p>
         </w:tc>
       </w:tr>
@@ -522,8 +574,18 @@
                 <w:sz w:val="20"/>
                 <w:szCs w:val="20"/>
               </w:rPr>
-              <w:t>Hello from Myfirstwebserver</w:t>
-            </w:r>
+              <w:t xml:space="preserve">Hello from </w:t>
+            </w:r>
+            <w:proofErr w:type="spellStart"/>
+            <w:r>
+              <w:rPr>
+                <w:color w:val="24292F"/>
+                <w:sz w:val="20"/>
+                <w:szCs w:val="20"/>
+              </w:rPr>
+              <w:t>Myfirstwebserver</w:t>
+            </w:r>
+            <w:proofErr w:type="spellEnd"/>
           </w:p>
         </w:tc>
       </w:tr>
@@ -645,8 +707,16 @@
         <w:rPr>
           <w:color w:val="24292F"/>
         </w:rPr>
-        <w:t>Set the server hostname to Myfirstwebserver</w:t>
-      </w:r>
+        <w:t xml:space="preserve">Set the server hostname to </w:t>
+      </w:r>
+      <w:proofErr w:type="spellStart"/>
+      <w:r>
+        <w:rPr>
+          <w:color w:val="24292F"/>
+        </w:rPr>
+        <w:t>Myfirstwebserver</w:t>
+      </w:r>
+      <w:proofErr w:type="spellEnd"/>
     </w:p>
     <w:p>
       <w:pPr>
@@ -661,7 +731,21 @@
         <w:rPr>
           <w:color w:val="24292F"/>
         </w:rPr>
-        <w:t>Display a custom webpage: "Hello from Myfirstwebserver"</w:t>
+        <w:t xml:space="preserve">Display a custom webpage: "Hello from </w:t>
+      </w:r>
+      <w:proofErr w:type="spellStart"/>
+      <w:r>
+        <w:rPr>
+          <w:color w:val="24292F"/>
+        </w:rPr>
+        <w:t>Myfirstwebserver</w:t>
+      </w:r>
+      <w:proofErr w:type="spellEnd"/>
+      <w:r>
+        <w:rPr>
+          <w:color w:val="24292F"/>
+        </w:rPr>
+        <w:t>"</w:t>
       </w:r>
     </w:p>
     <w:p>
@@ -1292,11 +1376,19 @@
         </w:numPr>
         <w:spacing w:before="40" w:after="40"/>
       </w:pPr>
+      <w:proofErr w:type="spellStart"/>
       <w:r>
         <w:rPr>
           <w:color w:val="24292F"/>
         </w:rPr>
-        <w:t>HashiCorp Terraform — syntax highlighting &amp; autocompletion</w:t>
+        <w:t>HashiCorp</w:t>
+      </w:r>
+      <w:proofErr w:type="spellEnd"/>
+      <w:r>
+        <w:rPr>
+          <w:color w:val="24292F"/>
+        </w:rPr>
+        <w:t xml:space="preserve"> Terraform — syntax highlighting &amp; autocompletion</w:t>
       </w:r>
     </w:p>
     <w:p>
@@ -1319,12 +1411,28 @@
       <w:pPr>
         <w:spacing w:before="60" w:after="80"/>
       </w:pPr>
+      <w:proofErr w:type="gramStart"/>
       <w:r>
         <w:rPr>
           <w:color w:val="24292F"/>
         </w:rPr>
-        <w:t>Install via Extensions panel: Ctrl+Shift+X</w:t>
-      </w:r>
+        <w:t>Install</w:t>
+      </w:r>
+      <w:proofErr w:type="gramEnd"/>
+      <w:r>
+        <w:rPr>
+          <w:color w:val="24292F"/>
+        </w:rPr>
+        <w:t xml:space="preserve"> via Extensions panel: </w:t>
+      </w:r>
+      <w:proofErr w:type="spellStart"/>
+      <w:r>
+        <w:rPr>
+          <w:color w:val="24292F"/>
+        </w:rPr>
+        <w:t>Ctrl+Shift+X</w:t>
+      </w:r>
+      <w:proofErr w:type="spellEnd"/>
     </w:p>
     <w:p>
       <w:pPr>
@@ -1368,7 +1476,21 @@
         <w:rPr>
           <w:color w:val="24292F"/>
         </w:rPr>
-        <w:t>IAM user/role with EC2FullAccess and VPCFullAccess permissions</w:t>
+        <w:t xml:space="preserve">IAM user/role with EC2FullAccess and </w:t>
+      </w:r>
+      <w:proofErr w:type="spellStart"/>
+      <w:r>
+        <w:rPr>
+          <w:color w:val="24292F"/>
+        </w:rPr>
+        <w:t>VPCFullAccess</w:t>
+      </w:r>
+      <w:proofErr w:type="spellEnd"/>
+      <w:r>
+        <w:rPr>
+          <w:color w:val="24292F"/>
+        </w:rPr>
+        <w:t xml:space="preserve"> permissions</w:t>
       </w:r>
     </w:p>
     <w:p>
@@ -1384,7 +1506,21 @@
         <w:rPr>
           <w:color w:val="24292F"/>
         </w:rPr>
-        <w:t>An existing EC2 Key Pair (.ppk) in your target region</w:t>
+        <w:t>An existing EC2 Key Pair (.</w:t>
+      </w:r>
+      <w:proofErr w:type="spellStart"/>
+      <w:r>
+        <w:rPr>
+          <w:color w:val="24292F"/>
+        </w:rPr>
+        <w:t>ppk</w:t>
+      </w:r>
+      <w:proofErr w:type="spellEnd"/>
+      <w:r>
+        <w:rPr>
+          <w:color w:val="24292F"/>
+        </w:rPr>
+        <w:t>) in your target region</w:t>
       </w:r>
     </w:p>
     <w:p>
@@ -1496,7 +1632,29 @@
           <w:sz w:val="18"/>
           <w:szCs w:val="18"/>
         </w:rPr>
-        <w:t>│   └── terraform.tfvars     # ⚠ Your values (excluded from Git)</w:t>
+        <w:t xml:space="preserve">│   └── </w:t>
+      </w:r>
+      <w:proofErr w:type="spellStart"/>
+      <w:proofErr w:type="gramStart"/>
+      <w:r>
+        <w:rPr>
+          <w:rFonts w:ascii="Courier New" w:eastAsia="Courier New" w:hAnsi="Courier New" w:cs="Courier New"/>
+          <w:color w:val="0550AE"/>
+          <w:sz w:val="18"/>
+          <w:szCs w:val="18"/>
+        </w:rPr>
+        <w:t>terraform.tfvars</w:t>
+      </w:r>
+      <w:proofErr w:type="spellEnd"/>
+      <w:proofErr w:type="gramEnd"/>
+      <w:r>
+        <w:rPr>
+          <w:rFonts w:ascii="Courier New" w:eastAsia="Courier New" w:hAnsi="Courier New" w:cs="Courier New"/>
+          <w:color w:val="0550AE"/>
+          <w:sz w:val="18"/>
+          <w:szCs w:val="18"/>
+        </w:rPr>
+        <w:t xml:space="preserve">     # ⚠ Your values (excluded from Git)</w:t>
       </w:r>
     </w:p>
     <w:p>
@@ -1512,8 +1670,50 @@
           <w:sz w:val="18"/>
           <w:szCs w:val="18"/>
         </w:rPr>
-        <w:t>├── .gitignore               # Excludes state, keys, tfvars</w:t>
-      </w:r>
+        <w:t>├─</w:t>
+      </w:r>
+      <w:proofErr w:type="gramStart"/>
+      <w:r>
+        <w:rPr>
+          <w:rFonts w:ascii="Courier New" w:eastAsia="Courier New" w:hAnsi="Courier New" w:cs="Courier New"/>
+          <w:color w:val="0550AE"/>
+          <w:sz w:val="18"/>
+          <w:szCs w:val="18"/>
+        </w:rPr>
+        <w:t>─ .</w:t>
+      </w:r>
+      <w:proofErr w:type="spellStart"/>
+      <w:r>
+        <w:rPr>
+          <w:rFonts w:ascii="Courier New" w:eastAsia="Courier New" w:hAnsi="Courier New" w:cs="Courier New"/>
+          <w:color w:val="0550AE"/>
+          <w:sz w:val="18"/>
+          <w:szCs w:val="18"/>
+        </w:rPr>
+        <w:t>gitignore</w:t>
+      </w:r>
+      <w:proofErr w:type="spellEnd"/>
+      <w:proofErr w:type="gramEnd"/>
+      <w:r>
+        <w:rPr>
+          <w:rFonts w:ascii="Courier New" w:eastAsia="Courier New" w:hAnsi="Courier New" w:cs="Courier New"/>
+          <w:color w:val="0550AE"/>
+          <w:sz w:val="18"/>
+          <w:szCs w:val="18"/>
+        </w:rPr>
+        <w:t xml:space="preserve">               # Excludes state, keys, </w:t>
+      </w:r>
+      <w:proofErr w:type="spellStart"/>
+      <w:r>
+        <w:rPr>
+          <w:rFonts w:ascii="Courier New" w:eastAsia="Courier New" w:hAnsi="Courier New" w:cs="Courier New"/>
+          <w:color w:val="0550AE"/>
+          <w:sz w:val="18"/>
+          <w:szCs w:val="18"/>
+        </w:rPr>
+        <w:t>tfvars</w:t>
+      </w:r>
+      <w:proofErr w:type="spellEnd"/>
     </w:p>
     <w:p>
       <w:pPr>
@@ -1569,7 +1769,15 @@
       </w:pPr>
       <w:r>
         <w:lastRenderedPageBreak/>
-        <w:t>Step 1 — Run aws configure</w:t>
+        <w:t xml:space="preserve">Step 1 — Run </w:t>
+      </w:r>
+      <w:proofErr w:type="spellStart"/>
+      <w:r>
+        <w:t>aws</w:t>
+      </w:r>
+      <w:proofErr w:type="spellEnd"/>
+      <w:r>
+        <w:t xml:space="preserve"> configure</w:t>
       </w:r>
     </w:p>
     <w:p>
@@ -1578,14 +1786,25 @@
         <w:spacing w:before="40" w:after="40"/>
         <w:ind w:left="360"/>
       </w:pPr>
-      <w:r>
-        <w:rPr>
-          <w:rFonts w:ascii="Courier New" w:eastAsia="Courier New" w:hAnsi="Courier New" w:cs="Courier New"/>
-          <w:color w:val="0550AE"/>
-          <w:sz w:val="18"/>
-          <w:szCs w:val="18"/>
-        </w:rPr>
-        <w:t>aws configure</w:t>
+      <w:proofErr w:type="spellStart"/>
+      <w:r>
+        <w:rPr>
+          <w:rFonts w:ascii="Courier New" w:eastAsia="Courier New" w:hAnsi="Courier New" w:cs="Courier New"/>
+          <w:color w:val="0550AE"/>
+          <w:sz w:val="18"/>
+          <w:szCs w:val="18"/>
+        </w:rPr>
+        <w:t>aws</w:t>
+      </w:r>
+      <w:proofErr w:type="spellEnd"/>
+      <w:r>
+        <w:rPr>
+          <w:rFonts w:ascii="Courier New" w:eastAsia="Courier New" w:hAnsi="Courier New" w:cs="Courier New"/>
+          <w:color w:val="0550AE"/>
+          <w:sz w:val="18"/>
+          <w:szCs w:val="18"/>
+        </w:rPr>
+        <w:t xml:space="preserve"> configure</w:t>
       </w:r>
     </w:p>
     <w:p>
@@ -1662,8 +1881,19 @@
           <w:sz w:val="18"/>
           <w:szCs w:val="18"/>
         </w:rPr>
-        <w:t>Default output format: json</w:t>
-      </w:r>
+        <w:t xml:space="preserve">Default output format: </w:t>
+      </w:r>
+      <w:proofErr w:type="spellStart"/>
+      <w:r>
+        <w:rPr>
+          <w:rFonts w:ascii="Courier New" w:eastAsia="Courier New" w:hAnsi="Courier New" w:cs="Courier New"/>
+          <w:color w:val="0550AE"/>
+          <w:sz w:val="18"/>
+          <w:szCs w:val="18"/>
+        </w:rPr>
+        <w:t>json</w:t>
+      </w:r>
+      <w:proofErr w:type="spellEnd"/>
     </w:p>
     <w:p>
       <w:pPr>
@@ -1760,7 +1990,35 @@
                 <w:sz w:val="20"/>
                 <w:szCs w:val="20"/>
               </w:rPr>
-              <w:t>Tip: Credentials are saved to ~/.aws/credentials and automatically picked up by Terraform.</w:t>
+              <w:t>Tip: Credentials are saved to ~</w:t>
+            </w:r>
+            <w:proofErr w:type="gramStart"/>
+            <w:r>
+              <w:rPr>
+                <w:color w:val="0550AE"/>
+                <w:sz w:val="20"/>
+                <w:szCs w:val="20"/>
+              </w:rPr>
+              <w:t>/.</w:t>
+            </w:r>
+            <w:proofErr w:type="spellStart"/>
+            <w:r>
+              <w:rPr>
+                <w:color w:val="0550AE"/>
+                <w:sz w:val="20"/>
+                <w:szCs w:val="20"/>
+              </w:rPr>
+              <w:t>aws</w:t>
+            </w:r>
+            <w:proofErr w:type="spellEnd"/>
+            <w:proofErr w:type="gramEnd"/>
+            <w:r>
+              <w:rPr>
+                <w:color w:val="0550AE"/>
+                <w:sz w:val="20"/>
+                <w:szCs w:val="20"/>
+              </w:rPr>
+              <w:t>/credentials and automatically picked up by Terraform.</w:t>
             </w:r>
           </w:p>
           <w:p>
@@ -1880,7 +2138,29 @@
         <w:rPr>
           <w:color w:val="24292F"/>
         </w:rPr>
-        <w:t>Select format: .ppk  (required for PuTTY on Windows)</w:t>
+        <w:t>Select format</w:t>
+      </w:r>
+      <w:proofErr w:type="gramStart"/>
+      <w:r>
+        <w:rPr>
+          <w:color w:val="24292F"/>
+        </w:rPr>
+        <w:t>: .</w:t>
+      </w:r>
+      <w:proofErr w:type="spellStart"/>
+      <w:r>
+        <w:rPr>
+          <w:color w:val="24292F"/>
+        </w:rPr>
+        <w:t>ppk</w:t>
+      </w:r>
+      <w:proofErr w:type="spellEnd"/>
+      <w:proofErr w:type="gramEnd"/>
+      <w:r>
+        <w:rPr>
+          <w:color w:val="24292F"/>
+        </w:rPr>
+        <w:t xml:space="preserve">  (required for PuTTY on Windows)</w:t>
       </w:r>
     </w:p>
     <w:p>
@@ -1896,7 +2176,21 @@
         <w:rPr>
           <w:color w:val="24292F"/>
         </w:rPr>
-        <w:t>Click Create — the .ppk file downloads automatically</w:t>
+        <w:t>Click Create — the .</w:t>
+      </w:r>
+      <w:proofErr w:type="spellStart"/>
+      <w:r>
+        <w:rPr>
+          <w:color w:val="24292F"/>
+        </w:rPr>
+        <w:t>ppk</w:t>
+      </w:r>
+      <w:proofErr w:type="spellEnd"/>
+      <w:r>
+        <w:rPr>
+          <w:color w:val="24292F"/>
+        </w:rPr>
+        <w:t xml:space="preserve"> file downloads automatically</w:t>
       </w:r>
     </w:p>
     <w:p>
@@ -1946,26 +2240,154 @@
             <w:pPr>
               <w:spacing w:before="40" w:after="40"/>
             </w:pPr>
+            <w:proofErr w:type="gramStart"/>
             <w:r>
               <w:rPr>
                 <w:color w:val="7D4E00"/>
                 <w:sz w:val="20"/>
                 <w:szCs w:val="20"/>
               </w:rPr>
-              <w:t>⚠  Save the .ppk file securely. AWS will not allow you to download it again.</w:t>
+              <w:t>⚠</w:t>
+            </w:r>
+            <w:r>
+              <w:rPr>
+                <w:color w:val="7D4E00"/>
+                <w:sz w:val="20"/>
+                <w:szCs w:val="20"/>
+              </w:rPr>
+              <w:t xml:space="preserve">  Save</w:t>
+            </w:r>
+            <w:proofErr w:type="gramEnd"/>
+            <w:r>
+              <w:rPr>
+                <w:color w:val="7D4E00"/>
+                <w:sz w:val="20"/>
+                <w:szCs w:val="20"/>
+              </w:rPr>
+              <w:t xml:space="preserve"> the .</w:t>
+            </w:r>
+            <w:proofErr w:type="spellStart"/>
+            <w:r>
+              <w:rPr>
+                <w:color w:val="7D4E00"/>
+                <w:sz w:val="20"/>
+                <w:szCs w:val="20"/>
+              </w:rPr>
+              <w:t>ppk</w:t>
+            </w:r>
+            <w:proofErr w:type="spellEnd"/>
+            <w:r>
+              <w:rPr>
+                <w:color w:val="7D4E00"/>
+                <w:sz w:val="20"/>
+                <w:szCs w:val="20"/>
+              </w:rPr>
+              <w:t xml:space="preserve"> file securely. AWS will not allow you to download it again.</w:t>
             </w:r>
           </w:p>
           <w:p>
             <w:pPr>
               <w:spacing w:before="40" w:after="40"/>
             </w:pPr>
+            <w:proofErr w:type="gramStart"/>
             <w:r>
               <w:rPr>
                 <w:color w:val="7D4E00"/>
                 <w:sz w:val="20"/>
                 <w:szCs w:val="20"/>
               </w:rPr>
-              <w:t>⚠  Do NOT commit .ppk or .pem files to GitHub — they are already excluded by .gitignore.</w:t>
+              <w:t>⚠</w:t>
+            </w:r>
+            <w:r>
+              <w:rPr>
+                <w:color w:val="7D4E00"/>
+                <w:sz w:val="20"/>
+                <w:szCs w:val="20"/>
+              </w:rPr>
+              <w:t xml:space="preserve">  Do</w:t>
+            </w:r>
+            <w:proofErr w:type="gramEnd"/>
+            <w:r>
+              <w:rPr>
+                <w:color w:val="7D4E00"/>
+                <w:sz w:val="20"/>
+                <w:szCs w:val="20"/>
+              </w:rPr>
+              <w:t xml:space="preserve"> NOT </w:t>
+            </w:r>
+            <w:proofErr w:type="gramStart"/>
+            <w:r>
+              <w:rPr>
+                <w:color w:val="7D4E00"/>
+                <w:sz w:val="20"/>
+                <w:szCs w:val="20"/>
+              </w:rPr>
+              <w:t>commit .</w:t>
+            </w:r>
+            <w:proofErr w:type="spellStart"/>
+            <w:r>
+              <w:rPr>
+                <w:color w:val="7D4E00"/>
+                <w:sz w:val="20"/>
+                <w:szCs w:val="20"/>
+              </w:rPr>
+              <w:t>ppk</w:t>
+            </w:r>
+            <w:proofErr w:type="spellEnd"/>
+            <w:proofErr w:type="gramEnd"/>
+            <w:r>
+              <w:rPr>
+                <w:color w:val="7D4E00"/>
+                <w:sz w:val="20"/>
+                <w:szCs w:val="20"/>
+              </w:rPr>
+              <w:t xml:space="preserve"> or .</w:t>
+            </w:r>
+            <w:proofErr w:type="spellStart"/>
+            <w:r>
+              <w:rPr>
+                <w:color w:val="7D4E00"/>
+                <w:sz w:val="20"/>
+                <w:szCs w:val="20"/>
+              </w:rPr>
+              <w:t>pem</w:t>
+            </w:r>
+            <w:proofErr w:type="spellEnd"/>
+            <w:r>
+              <w:rPr>
+                <w:color w:val="7D4E00"/>
+                <w:sz w:val="20"/>
+                <w:szCs w:val="20"/>
+              </w:rPr>
+              <w:t xml:space="preserve"> files to GitHub — they are already excluded </w:t>
+            </w:r>
+            <w:proofErr w:type="gramStart"/>
+            <w:r>
+              <w:rPr>
+                <w:color w:val="7D4E00"/>
+                <w:sz w:val="20"/>
+                <w:szCs w:val="20"/>
+              </w:rPr>
+              <w:t>by .</w:t>
+            </w:r>
+            <w:proofErr w:type="spellStart"/>
+            <w:r>
+              <w:rPr>
+                <w:color w:val="7D4E00"/>
+                <w:sz w:val="20"/>
+                <w:szCs w:val="20"/>
+              </w:rPr>
+              <w:t>gitignore</w:t>
+            </w:r>
+            <w:proofErr w:type="spellEnd"/>
+            <w:proofErr w:type="gramEnd"/>
+            <w:r>
+              <w:rPr>
+                <w:color w:val="7D4E00"/>
+                <w:sz w:val="20"/>
+                <w:szCs w:val="20"/>
+              </w:rPr>
+              <w:t>.</w:t>
             </w:r>
           </w:p>
         </w:tc>
@@ -1981,8 +2403,23 @@
         <w:pStyle w:val="Heading3"/>
       </w:pPr>
       <w:r>
-        <w:t>Step 2 — Update terraform.tfvars</w:t>
-      </w:r>
+        <w:t xml:space="preserve">Step 2 — </w:t>
+      </w:r>
+      <w:proofErr w:type="gramStart"/>
+      <w:r>
+        <w:t>Update</w:t>
+      </w:r>
+      <w:proofErr w:type="gramEnd"/>
+      <w:r>
+        <w:t xml:space="preserve"> </w:t>
+      </w:r>
+      <w:proofErr w:type="spellStart"/>
+      <w:proofErr w:type="gramStart"/>
+      <w:r>
+        <w:t>terraform.tfvars</w:t>
+      </w:r>
+      <w:proofErr w:type="spellEnd"/>
+      <w:proofErr w:type="gramEnd"/>
     </w:p>
     <w:p>
       <w:pPr>
@@ -1992,7 +2429,21 @@
         <w:rPr>
           <w:color w:val="24292F"/>
         </w:rPr>
-        <w:t>Open terraform/terraform.tfvars and enter your key pair name:</w:t>
+        <w:t>Open terraform/</w:t>
+      </w:r>
+      <w:proofErr w:type="spellStart"/>
+      <w:r>
+        <w:rPr>
+          <w:color w:val="24292F"/>
+        </w:rPr>
+        <w:t>terraform.tfvars</w:t>
+      </w:r>
+      <w:proofErr w:type="spellEnd"/>
+      <w:r>
+        <w:rPr>
+          <w:color w:val="24292F"/>
+        </w:rPr>
+        <w:t xml:space="preserve"> and enter your key pair name:</w:t>
       </w:r>
     </w:p>
     <w:p>
@@ -2001,14 +2452,45 @@
         <w:spacing w:before="40" w:after="40"/>
         <w:ind w:left="360"/>
       </w:pPr>
-      <w:r>
-        <w:rPr>
-          <w:rFonts w:ascii="Courier New" w:eastAsia="Courier New" w:hAnsi="Courier New" w:cs="Courier New"/>
-          <w:color w:val="0550AE"/>
-          <w:sz w:val="18"/>
-          <w:szCs w:val="18"/>
-        </w:rPr>
-        <w:t>key_pair_name = "my-keypair"   # Must match name in AWS Console exactly</w:t>
+      <w:proofErr w:type="spellStart"/>
+      <w:r>
+        <w:rPr>
+          <w:rFonts w:ascii="Courier New" w:eastAsia="Courier New" w:hAnsi="Courier New" w:cs="Courier New"/>
+          <w:color w:val="0550AE"/>
+          <w:sz w:val="18"/>
+          <w:szCs w:val="18"/>
+        </w:rPr>
+        <w:t>key_pair_name</w:t>
+      </w:r>
+      <w:proofErr w:type="spellEnd"/>
+      <w:r>
+        <w:rPr>
+          <w:rFonts w:ascii="Courier New" w:eastAsia="Courier New" w:hAnsi="Courier New" w:cs="Courier New"/>
+          <w:color w:val="0550AE"/>
+          <w:sz w:val="18"/>
+          <w:szCs w:val="18"/>
+        </w:rPr>
+        <w:t xml:space="preserve"> = "my-</w:t>
+      </w:r>
+      <w:proofErr w:type="gramStart"/>
+      <w:r>
+        <w:rPr>
+          <w:rFonts w:ascii="Courier New" w:eastAsia="Courier New" w:hAnsi="Courier New" w:cs="Courier New"/>
+          <w:color w:val="0550AE"/>
+          <w:sz w:val="18"/>
+          <w:szCs w:val="18"/>
+        </w:rPr>
+        <w:t>keypair"   #</w:t>
+      </w:r>
+      <w:proofErr w:type="gramEnd"/>
+      <w:r>
+        <w:rPr>
+          <w:rFonts w:ascii="Courier New" w:eastAsia="Courier New" w:hAnsi="Courier New" w:cs="Courier New"/>
+          <w:color w:val="0550AE"/>
+          <w:sz w:val="18"/>
+          <w:szCs w:val="18"/>
+        </w:rPr>
+        <w:t xml:space="preserve"> Must match name in AWS Console exactly</w:t>
       </w:r>
     </w:p>
     <w:p>
@@ -2114,15 +2596,37 @@
         <w:spacing w:before="40" w:after="40"/>
         <w:ind w:left="360"/>
       </w:pPr>
-      <w:r>
-        <w:rPr>
-          <w:rFonts w:ascii="Courier New" w:eastAsia="Courier New" w:hAnsi="Courier New" w:cs="Courier New"/>
-          <w:color w:val="0550AE"/>
-          <w:sz w:val="18"/>
-          <w:szCs w:val="18"/>
-        </w:rPr>
-        <w:t>terraform init</w:t>
-      </w:r>
+      <w:proofErr w:type="gramStart"/>
+      <w:r>
+        <w:rPr>
+          <w:rFonts w:ascii="Courier New" w:eastAsia="Courier New" w:hAnsi="Courier New" w:cs="Courier New"/>
+          <w:color w:val="0550AE"/>
+          <w:sz w:val="18"/>
+          <w:szCs w:val="18"/>
+        </w:rPr>
+        <w:t>terraform</w:t>
+      </w:r>
+      <w:proofErr w:type="gramEnd"/>
+      <w:r>
+        <w:rPr>
+          <w:rFonts w:ascii="Courier New" w:eastAsia="Courier New" w:hAnsi="Courier New" w:cs="Courier New"/>
+          <w:color w:val="0550AE"/>
+          <w:sz w:val="18"/>
+          <w:szCs w:val="18"/>
+        </w:rPr>
+        <w:t xml:space="preserve"> </w:t>
+      </w:r>
+      <w:proofErr w:type="spellStart"/>
+      <w:r>
+        <w:rPr>
+          <w:rFonts w:ascii="Courier New" w:eastAsia="Courier New" w:hAnsi="Courier New" w:cs="Courier New"/>
+          <w:color w:val="0550AE"/>
+          <w:sz w:val="18"/>
+          <w:szCs w:val="18"/>
+        </w:rPr>
+        <w:t>init</w:t>
+      </w:r>
+      <w:proofErr w:type="spellEnd"/>
     </w:p>
     <w:p>
       <w:pPr>
@@ -2256,6 +2760,7 @@
         <w:spacing w:before="40" w:after="40"/>
         <w:ind w:left="360"/>
       </w:pPr>
+      <w:proofErr w:type="gramStart"/>
       <w:r>
         <w:rPr>
           <w:rFonts w:ascii="Courier New" w:eastAsia="Courier New" w:hAnsi="Courier New" w:cs="Courier New"/>
@@ -2265,6 +2770,7 @@
         </w:rPr>
         <w:t>terraform apply</w:t>
       </w:r>
+      <w:proofErr w:type="gramEnd"/>
     </w:p>
     <w:p>
       <w:pPr>
@@ -2410,7 +2916,25 @@
                 <w:sz w:val="20"/>
                 <w:szCs w:val="20"/>
               </w:rPr>
-              <w:t>Wait 60–90 seconds after apply for User Data to finish installing and starting Apache</w:t>
+              <w:t xml:space="preserve">Wait 60–90 seconds after </w:t>
+            </w:r>
+            <w:proofErr w:type="gramStart"/>
+            <w:r>
+              <w:rPr>
+                <w:color w:val="0550AE"/>
+                <w:sz w:val="20"/>
+                <w:szCs w:val="20"/>
+              </w:rPr>
+              <w:t>apply</w:t>
+            </w:r>
+            <w:proofErr w:type="gramEnd"/>
+            <w:r>
+              <w:rPr>
+                <w:color w:val="0550AE"/>
+                <w:sz w:val="20"/>
+                <w:szCs w:val="20"/>
+              </w:rPr>
+              <w:t xml:space="preserve"> for User Data to finish installing and starting Apache</w:t>
             </w:r>
           </w:p>
           <w:p>
@@ -2466,8 +2990,19 @@
           <w:sz w:val="18"/>
           <w:szCs w:val="18"/>
         </w:rPr>
-        <w:t>terraform output public_ip</w:t>
-      </w:r>
+        <w:t xml:space="preserve">terraform output </w:t>
+      </w:r>
+      <w:proofErr w:type="spellStart"/>
+      <w:r>
+        <w:rPr>
+          <w:rFonts w:ascii="Courier New" w:eastAsia="Courier New" w:hAnsi="Courier New" w:cs="Courier New"/>
+          <w:color w:val="0550AE"/>
+          <w:sz w:val="18"/>
+          <w:szCs w:val="18"/>
+        </w:rPr>
+        <w:t>public_ip</w:t>
+      </w:r>
+      <w:proofErr w:type="spellEnd"/>
     </w:p>
     <w:p>
       <w:pPr>
@@ -2511,7 +3046,49 @@
         <w:rPr>
           <w:color w:val="24292F"/>
         </w:rPr>
-        <w:t>In Host Name, enter:  ec2-user@&lt;public-ip&gt;</w:t>
+        <w:t>In Host Name, enter</w:t>
+      </w:r>
+      <w:proofErr w:type="gramStart"/>
+      <w:r>
+        <w:rPr>
+          <w:color w:val="24292F"/>
+        </w:rPr>
+        <w:t>:  ec2</w:t>
+      </w:r>
+      <w:proofErr w:type="gramEnd"/>
+      <w:r>
+        <w:rPr>
+          <w:color w:val="24292F"/>
+        </w:rPr>
+        <w:t>-</w:t>
+      </w:r>
+      <w:proofErr w:type="gramStart"/>
+      <w:r>
+        <w:rPr>
+          <w:color w:val="24292F"/>
+        </w:rPr>
+        <w:t>user@</w:t>
+      </w:r>
+      <w:proofErr w:type="gramEnd"/>
+      <w:r>
+        <w:rPr>
+          <w:color w:val="24292F"/>
+        </w:rPr>
+        <w:t>&lt;public-</w:t>
+      </w:r>
+      <w:proofErr w:type="spellStart"/>
+      <w:r>
+        <w:rPr>
+          <w:color w:val="24292F"/>
+        </w:rPr>
+        <w:t>ip</w:t>
+      </w:r>
+      <w:proofErr w:type="spellEnd"/>
+      <w:r>
+        <w:rPr>
+          <w:color w:val="24292F"/>
+        </w:rPr>
+        <w:t>&gt;</w:t>
       </w:r>
     </w:p>
     <w:p>
@@ -2588,7 +3165,21 @@
         <w:rPr>
           <w:color w:val="24292F"/>
         </w:rPr>
-        <w:t>Select your .ppk file</w:t>
+        <w:t>Select your .</w:t>
+      </w:r>
+      <w:proofErr w:type="spellStart"/>
+      <w:r>
+        <w:rPr>
+          <w:color w:val="24292F"/>
+        </w:rPr>
+        <w:t>ppk</w:t>
+      </w:r>
+      <w:proofErr w:type="spellEnd"/>
+      <w:r>
+        <w:rPr>
+          <w:color w:val="24292F"/>
+        </w:rPr>
+        <w:t xml:space="preserve"> file</w:t>
       </w:r>
     </w:p>
     <w:p>
@@ -2633,7 +3224,21 @@
         <w:rPr>
           <w:color w:val="24292F"/>
         </w:rPr>
-        <w:t>Enter a name (e.g., Myfirstwebserver) under Saved Sessions</w:t>
+        <w:t xml:space="preserve">Enter a name (e.g., </w:t>
+      </w:r>
+      <w:proofErr w:type="spellStart"/>
+      <w:r>
+        <w:rPr>
+          <w:color w:val="24292F"/>
+        </w:rPr>
+        <w:t>Myfirstwebserver</w:t>
+      </w:r>
+      <w:proofErr w:type="spellEnd"/>
+      <w:r>
+        <w:rPr>
+          <w:color w:val="24292F"/>
+        </w:rPr>
+        <w:t>) under Saved Sessions</w:t>
       </w:r>
     </w:p>
     <w:p>
@@ -2778,7 +3383,25 @@
                 <w:sz w:val="20"/>
                 <w:szCs w:val="20"/>
               </w:rPr>
-              <w:t>The prompt shows Myfirstwebserver — confirming the hostname was set correctly by User Data.</w:t>
+              <w:t xml:space="preserve">The prompt shows </w:t>
+            </w:r>
+            <w:proofErr w:type="spellStart"/>
+            <w:r>
+              <w:rPr>
+                <w:color w:val="0550AE"/>
+                <w:sz w:val="20"/>
+                <w:szCs w:val="20"/>
+              </w:rPr>
+              <w:t>Myfirstwebserver</w:t>
+            </w:r>
+            <w:proofErr w:type="spellEnd"/>
+            <w:r>
+              <w:rPr>
+                <w:color w:val="0550AE"/>
+                <w:sz w:val="20"/>
+                <w:szCs w:val="20"/>
+              </w:rPr>
+              <w:t xml:space="preserve"> — confirming the hostname was set correctly by User Data.</w:t>
             </w:r>
           </w:p>
         </w:tc>
@@ -2813,7 +3436,21 @@
         <w:rPr>
           <w:color w:val="24292F"/>
         </w:rPr>
-        <w:t>Copy the website_url output from Terraform</w:t>
+        <w:t xml:space="preserve">Copy the </w:t>
+      </w:r>
+      <w:proofErr w:type="spellStart"/>
+      <w:r>
+        <w:rPr>
+          <w:color w:val="24292F"/>
+        </w:rPr>
+        <w:t>website_url</w:t>
+      </w:r>
+      <w:proofErr w:type="spellEnd"/>
+      <w:r>
+        <w:rPr>
+          <w:color w:val="24292F"/>
+        </w:rPr>
+        <w:t xml:space="preserve"> output from Terraform</w:t>
       </w:r>
     </w:p>
     <w:p>
@@ -2966,8 +3603,16 @@
         <w:rPr>
           <w:color w:val="24292F"/>
         </w:rPr>
-        <w:t>Expected output: Myfirstwebserver</w:t>
-      </w:r>
+        <w:t xml:space="preserve">Expected output: </w:t>
+      </w:r>
+      <w:proofErr w:type="spellStart"/>
+      <w:r>
+        <w:rPr>
+          <w:color w:val="24292F"/>
+        </w:rPr>
+        <w:t>Myfirstwebserver</w:t>
+      </w:r>
+      <w:proofErr w:type="spellEnd"/>
     </w:p>
     <w:p>
       <w:pPr>
@@ -3025,14 +3670,45 @@
         <w:spacing w:before="40" w:after="40"/>
         <w:ind w:left="360"/>
       </w:pPr>
-      <w:r>
-        <w:rPr>
-          <w:rFonts w:ascii="Courier New" w:eastAsia="Courier New" w:hAnsi="Courier New" w:cs="Courier New"/>
-          <w:color w:val="0550AE"/>
-          <w:sz w:val="18"/>
-          <w:szCs w:val="18"/>
-        </w:rPr>
-        <w:t>sudo systemctl status httpd</w:t>
+      <w:proofErr w:type="spellStart"/>
+      <w:r>
+        <w:rPr>
+          <w:rFonts w:ascii="Courier New" w:eastAsia="Courier New" w:hAnsi="Courier New" w:cs="Courier New"/>
+          <w:color w:val="0550AE"/>
+          <w:sz w:val="18"/>
+          <w:szCs w:val="18"/>
+        </w:rPr>
+        <w:t>sudo</w:t>
+      </w:r>
+      <w:proofErr w:type="spellEnd"/>
+      <w:r>
+        <w:rPr>
+          <w:rFonts w:ascii="Courier New" w:eastAsia="Courier New" w:hAnsi="Courier New" w:cs="Courier New"/>
+          <w:color w:val="0550AE"/>
+          <w:sz w:val="18"/>
+          <w:szCs w:val="18"/>
+        </w:rPr>
+        <w:t xml:space="preserve"> </w:t>
+      </w:r>
+      <w:proofErr w:type="spellStart"/>
+      <w:r>
+        <w:rPr>
+          <w:rFonts w:ascii="Courier New" w:eastAsia="Courier New" w:hAnsi="Courier New" w:cs="Courier New"/>
+          <w:color w:val="0550AE"/>
+          <w:sz w:val="18"/>
+          <w:szCs w:val="18"/>
+        </w:rPr>
+        <w:t>systemctl</w:t>
+      </w:r>
+      <w:proofErr w:type="spellEnd"/>
+      <w:r>
+        <w:rPr>
+          <w:rFonts w:ascii="Courier New" w:eastAsia="Courier New" w:hAnsi="Courier New" w:cs="Courier New"/>
+          <w:color w:val="0550AE"/>
+          <w:sz w:val="18"/>
+          <w:szCs w:val="18"/>
+        </w:rPr>
+        <w:t xml:space="preserve"> status httpd</w:t>
       </w:r>
     </w:p>
     <w:p>
@@ -3103,14 +3779,25 @@
         <w:spacing w:before="40" w:after="40"/>
         <w:ind w:left="360"/>
       </w:pPr>
-      <w:r>
-        <w:rPr>
-          <w:rFonts w:ascii="Courier New" w:eastAsia="Courier New" w:hAnsi="Courier New" w:cs="Courier New"/>
-          <w:color w:val="0550AE"/>
-          <w:sz w:val="18"/>
-          <w:szCs w:val="18"/>
-        </w:rPr>
-        <w:t>sudo cat /var/log/cloud-init-output.log | tail -20</w:t>
+      <w:proofErr w:type="spellStart"/>
+      <w:r>
+        <w:rPr>
+          <w:rFonts w:ascii="Courier New" w:eastAsia="Courier New" w:hAnsi="Courier New" w:cs="Courier New"/>
+          <w:color w:val="0550AE"/>
+          <w:sz w:val="18"/>
+          <w:szCs w:val="18"/>
+        </w:rPr>
+        <w:t>sudo</w:t>
+      </w:r>
+      <w:proofErr w:type="spellEnd"/>
+      <w:r>
+        <w:rPr>
+          <w:rFonts w:ascii="Courier New" w:eastAsia="Courier New" w:hAnsi="Courier New" w:cs="Courier New"/>
+          <w:color w:val="0550AE"/>
+          <w:sz w:val="18"/>
+          <w:szCs w:val="18"/>
+        </w:rPr>
+        <w:t xml:space="preserve"> cat /var/log/cloud-init-output.log | tail -20</w:t>
       </w:r>
     </w:p>
     <w:p>
@@ -3253,8 +3940,19 @@
           <w:sz w:val="18"/>
           <w:szCs w:val="18"/>
         </w:rPr>
-        <w:t>git init</w:t>
-      </w:r>
+        <w:t xml:space="preserve">git </w:t>
+      </w:r>
+      <w:proofErr w:type="spellStart"/>
+      <w:r>
+        <w:rPr>
+          <w:rFonts w:ascii="Courier New" w:eastAsia="Courier New" w:hAnsi="Courier New" w:cs="Courier New"/>
+          <w:color w:val="0550AE"/>
+          <w:sz w:val="18"/>
+          <w:szCs w:val="18"/>
+        </w:rPr>
+        <w:t>init</w:t>
+      </w:r>
+      <w:proofErr w:type="spellEnd"/>
     </w:p>
     <w:p>
       <w:pPr>
@@ -3269,8 +3967,19 @@
           <w:sz w:val="18"/>
           <w:szCs w:val="18"/>
         </w:rPr>
-        <w:t>git add .</w:t>
-      </w:r>
+        <w:t xml:space="preserve">git </w:t>
+      </w:r>
+      <w:proofErr w:type="gramStart"/>
+      <w:r>
+        <w:rPr>
+          <w:rFonts w:ascii="Courier New" w:eastAsia="Courier New" w:hAnsi="Courier New" w:cs="Courier New"/>
+          <w:color w:val="0550AE"/>
+          <w:sz w:val="18"/>
+          <w:szCs w:val="18"/>
+        </w:rPr>
+        <w:t>add .</w:t>
+      </w:r>
+      <w:proofErr w:type="gramEnd"/>
     </w:p>
     <w:p>
       <w:pPr>
@@ -3293,6 +4002,12 @@
         <w:shd w:val="clear" w:color="auto" w:fill="F6F8FA"/>
         <w:spacing w:before="40" w:after="40"/>
         <w:ind w:left="360"/>
+        <w:rPr>
+          <w:rFonts w:ascii="Courier New" w:eastAsia="Courier New" w:hAnsi="Courier New" w:cs="Courier New"/>
+          <w:color w:val="0550AE"/>
+          <w:sz w:val="18"/>
+          <w:szCs w:val="18"/>
+        </w:rPr>
       </w:pPr>
       <w:r>
         <w:rPr>
@@ -3309,6 +4024,363 @@
         <w:shd w:val="clear" w:color="auto" w:fill="F6F8FA"/>
         <w:spacing w:before="40" w:after="40"/>
         <w:ind w:left="360"/>
+        <w:rPr>
+          <w:rFonts w:ascii="Courier New" w:eastAsia="Courier New" w:hAnsi="Courier New" w:cs="Courier New"/>
+          <w:color w:val="0550AE"/>
+          <w:sz w:val="18"/>
+          <w:szCs w:val="18"/>
+        </w:rPr>
+      </w:pPr>
+      <w:r>
+        <w:rPr>
+          <w:rFonts w:ascii="Courier New" w:eastAsia="Courier New" w:hAnsi="Courier New" w:cs="Courier New"/>
+          <w:color w:val="0550AE"/>
+          <w:sz w:val="18"/>
+          <w:szCs w:val="18"/>
+        </w:rPr>
+        <w:br/>
+      </w:r>
+      <w:r>
+        <w:rPr>
+          <w:rFonts w:ascii="Courier New" w:eastAsia="Courier New" w:hAnsi="Courier New" w:cs="Courier New"/>
+          <w:color w:val="0550AE"/>
+          <w:sz w:val="18"/>
+          <w:szCs w:val="18"/>
+        </w:rPr>
+        <w:t>-------</w:t>
+      </w:r>
+    </w:p>
+    <w:p>
+      <w:pPr>
+        <w:shd w:val="clear" w:color="auto" w:fill="F6F8FA"/>
+        <w:spacing w:before="40" w:after="40"/>
+        <w:ind w:left="360"/>
+        <w:rPr>
+          <w:rFonts w:ascii="Courier New" w:eastAsia="Courier New" w:hAnsi="Courier New" w:cs="Courier New"/>
+          <w:b/>
+          <w:bCs/>
+          <w:color w:val="0550AE"/>
+          <w:sz w:val="18"/>
+          <w:szCs w:val="18"/>
+        </w:rPr>
+      </w:pPr>
+      <w:r>
+        <w:rPr>
+          <w:rFonts w:ascii="Courier New" w:eastAsia="Courier New" w:hAnsi="Courier New" w:cs="Courier New"/>
+          <w:b/>
+          <w:bCs/>
+          <w:color w:val="0550AE"/>
+          <w:sz w:val="18"/>
+          <w:szCs w:val="18"/>
+        </w:rPr>
+        <w:t>Create the Repository on GitHub First</w:t>
+      </w:r>
+    </w:p>
+    <w:p>
+      <w:pPr>
+        <w:numPr>
+          <w:ilvl w:val="0"/>
+          <w:numId w:val="5"/>
+        </w:numPr>
+        <w:shd w:val="clear" w:color="auto" w:fill="F6F8FA"/>
+        <w:spacing w:before="40" w:after="40"/>
+        <w:rPr>
+          <w:rFonts w:ascii="Courier New" w:eastAsia="Courier New" w:hAnsi="Courier New" w:cs="Courier New"/>
+          <w:color w:val="0550AE"/>
+          <w:sz w:val="18"/>
+          <w:szCs w:val="18"/>
+        </w:rPr>
+      </w:pPr>
+      <w:r>
+        <w:rPr>
+          <w:rFonts w:ascii="Courier New" w:eastAsia="Courier New" w:hAnsi="Courier New" w:cs="Courier New"/>
+          <w:color w:val="0550AE"/>
+          <w:sz w:val="18"/>
+          <w:szCs w:val="18"/>
+        </w:rPr>
+        <w:t xml:space="preserve">Go to </w:t>
+      </w:r>
+      <w:r>
+        <w:rPr>
+          <w:rFonts w:ascii="Courier New" w:eastAsia="Courier New" w:hAnsi="Courier New" w:cs="Courier New"/>
+          <w:b/>
+          <w:bCs/>
+          <w:color w:val="0550AE"/>
+          <w:sz w:val="18"/>
+          <w:szCs w:val="18"/>
+        </w:rPr>
+        <w:t>github.com</w:t>
+      </w:r>
+      <w:r>
+        <w:rPr>
+          <w:rFonts w:ascii="Courier New" w:eastAsia="Courier New" w:hAnsi="Courier New" w:cs="Courier New"/>
+          <w:color w:val="0550AE"/>
+          <w:sz w:val="18"/>
+          <w:szCs w:val="18"/>
+        </w:rPr>
+        <w:t xml:space="preserve"> and log in</w:t>
+      </w:r>
+    </w:p>
+    <w:p>
+      <w:pPr>
+        <w:numPr>
+          <w:ilvl w:val="0"/>
+          <w:numId w:val="5"/>
+        </w:numPr>
+        <w:shd w:val="clear" w:color="auto" w:fill="F6F8FA"/>
+        <w:spacing w:before="40" w:after="40"/>
+        <w:rPr>
+          <w:rFonts w:ascii="Courier New" w:eastAsia="Courier New" w:hAnsi="Courier New" w:cs="Courier New"/>
+          <w:color w:val="0550AE"/>
+          <w:sz w:val="18"/>
+          <w:szCs w:val="18"/>
+        </w:rPr>
+      </w:pPr>
+      <w:r>
+        <w:rPr>
+          <w:rFonts w:ascii="Courier New" w:eastAsia="Courier New" w:hAnsi="Courier New" w:cs="Courier New"/>
+          <w:color w:val="0550AE"/>
+          <w:sz w:val="18"/>
+          <w:szCs w:val="18"/>
+        </w:rPr>
+        <w:lastRenderedPageBreak/>
+        <w:t xml:space="preserve">Click the </w:t>
+      </w:r>
+      <w:r>
+        <w:rPr>
+          <w:rFonts w:ascii="Courier New" w:eastAsia="Courier New" w:hAnsi="Courier New" w:cs="Courier New"/>
+          <w:b/>
+          <w:bCs/>
+          <w:color w:val="0550AE"/>
+          <w:sz w:val="18"/>
+          <w:szCs w:val="18"/>
+        </w:rPr>
+        <w:t>+</w:t>
+      </w:r>
+      <w:r>
+        <w:rPr>
+          <w:rFonts w:ascii="Courier New" w:eastAsia="Courier New" w:hAnsi="Courier New" w:cs="Courier New"/>
+          <w:color w:val="0550AE"/>
+          <w:sz w:val="18"/>
+          <w:szCs w:val="18"/>
+        </w:rPr>
+        <w:t xml:space="preserve"> icon (top right) → </w:t>
+      </w:r>
+      <w:r>
+        <w:rPr>
+          <w:rFonts w:ascii="Courier New" w:eastAsia="Courier New" w:hAnsi="Courier New" w:cs="Courier New"/>
+          <w:b/>
+          <w:bCs/>
+          <w:color w:val="0550AE"/>
+          <w:sz w:val="18"/>
+          <w:szCs w:val="18"/>
+        </w:rPr>
+        <w:t>New repository</w:t>
+      </w:r>
+    </w:p>
+    <w:p>
+      <w:pPr>
+        <w:numPr>
+          <w:ilvl w:val="0"/>
+          <w:numId w:val="5"/>
+        </w:numPr>
+        <w:shd w:val="clear" w:color="auto" w:fill="F6F8FA"/>
+        <w:spacing w:before="40" w:after="40"/>
+        <w:rPr>
+          <w:rFonts w:ascii="Courier New" w:eastAsia="Courier New" w:hAnsi="Courier New" w:cs="Courier New"/>
+          <w:color w:val="0550AE"/>
+          <w:sz w:val="18"/>
+          <w:szCs w:val="18"/>
+        </w:rPr>
+      </w:pPr>
+      <w:r>
+        <w:rPr>
+          <w:rFonts w:ascii="Courier New" w:eastAsia="Courier New" w:hAnsi="Courier New" w:cs="Courier New"/>
+          <w:color w:val="0550AE"/>
+          <w:sz w:val="18"/>
+          <w:szCs w:val="18"/>
+        </w:rPr>
+        <w:t>Name it: apache-ec2-terraform</w:t>
+      </w:r>
+    </w:p>
+    <w:p>
+      <w:pPr>
+        <w:numPr>
+          <w:ilvl w:val="0"/>
+          <w:numId w:val="5"/>
+        </w:numPr>
+        <w:shd w:val="clear" w:color="auto" w:fill="F6F8FA"/>
+        <w:spacing w:before="40" w:after="40"/>
+        <w:rPr>
+          <w:rFonts w:ascii="Courier New" w:eastAsia="Courier New" w:hAnsi="Courier New" w:cs="Courier New"/>
+          <w:color w:val="0550AE"/>
+          <w:sz w:val="18"/>
+          <w:szCs w:val="18"/>
+        </w:rPr>
+      </w:pPr>
+      <w:r>
+        <w:rPr>
+          <w:rFonts w:ascii="Courier New" w:eastAsia="Courier New" w:hAnsi="Courier New" w:cs="Courier New"/>
+          <w:color w:val="0550AE"/>
+          <w:sz w:val="18"/>
+          <w:szCs w:val="18"/>
+        </w:rPr>
+        <w:t xml:space="preserve">Set to </w:t>
+      </w:r>
+      <w:r>
+        <w:rPr>
+          <w:rFonts w:ascii="Courier New" w:eastAsia="Courier New" w:hAnsi="Courier New" w:cs="Courier New"/>
+          <w:b/>
+          <w:bCs/>
+          <w:color w:val="0550AE"/>
+          <w:sz w:val="18"/>
+          <w:szCs w:val="18"/>
+        </w:rPr>
+        <w:t>Public</w:t>
+      </w:r>
+      <w:r>
+        <w:rPr>
+          <w:rFonts w:ascii="Courier New" w:eastAsia="Courier New" w:hAnsi="Courier New" w:cs="Courier New"/>
+          <w:color w:val="0550AE"/>
+          <w:sz w:val="18"/>
+          <w:szCs w:val="18"/>
+        </w:rPr>
+        <w:t xml:space="preserve"> or </w:t>
+      </w:r>
+      <w:r>
+        <w:rPr>
+          <w:rFonts w:ascii="Courier New" w:eastAsia="Courier New" w:hAnsi="Courier New" w:cs="Courier New"/>
+          <w:b/>
+          <w:bCs/>
+          <w:color w:val="0550AE"/>
+          <w:sz w:val="18"/>
+          <w:szCs w:val="18"/>
+        </w:rPr>
+        <w:t>Private</w:t>
+      </w:r>
+    </w:p>
+    <w:p>
+      <w:pPr>
+        <w:numPr>
+          <w:ilvl w:val="0"/>
+          <w:numId w:val="5"/>
+        </w:numPr>
+        <w:shd w:val="clear" w:color="auto" w:fill="F6F8FA"/>
+        <w:spacing w:before="40" w:after="40"/>
+        <w:rPr>
+          <w:rFonts w:ascii="Courier New" w:eastAsia="Courier New" w:hAnsi="Courier New" w:cs="Courier New"/>
+          <w:color w:val="0550AE"/>
+          <w:sz w:val="18"/>
+          <w:szCs w:val="18"/>
+        </w:rPr>
+      </w:pPr>
+      <w:r>
+        <w:rPr>
+          <w:rFonts w:ascii="Courier New" w:eastAsia="Courier New" w:hAnsi="Courier New" w:cs="Courier New"/>
+          <w:b/>
+          <w:bCs/>
+          <w:color w:val="0550AE"/>
+          <w:sz w:val="18"/>
+          <w:szCs w:val="18"/>
+        </w:rPr>
+        <w:t>Do NOT</w:t>
+      </w:r>
+      <w:r>
+        <w:rPr>
+          <w:rFonts w:ascii="Courier New" w:eastAsia="Courier New" w:hAnsi="Courier New" w:cs="Courier New"/>
+          <w:color w:val="0550AE"/>
+          <w:sz w:val="18"/>
+          <w:szCs w:val="18"/>
+        </w:rPr>
+        <w:t xml:space="preserve"> check "Add README" or any other </w:t>
+      </w:r>
+      <w:proofErr w:type="spellStart"/>
+      <w:r>
+        <w:rPr>
+          <w:rFonts w:ascii="Courier New" w:eastAsia="Courier New" w:hAnsi="Courier New" w:cs="Courier New"/>
+          <w:color w:val="0550AE"/>
+          <w:sz w:val="18"/>
+          <w:szCs w:val="18"/>
+        </w:rPr>
+        <w:t>init</w:t>
+      </w:r>
+      <w:proofErr w:type="spellEnd"/>
+      <w:r>
+        <w:rPr>
+          <w:rFonts w:ascii="Courier New" w:eastAsia="Courier New" w:hAnsi="Courier New" w:cs="Courier New"/>
+          <w:color w:val="0550AE"/>
+          <w:sz w:val="18"/>
+          <w:szCs w:val="18"/>
+        </w:rPr>
+        <w:t xml:space="preserve"> options</w:t>
+      </w:r>
+    </w:p>
+    <w:p>
+      <w:pPr>
+        <w:numPr>
+          <w:ilvl w:val="0"/>
+          <w:numId w:val="5"/>
+        </w:numPr>
+        <w:shd w:val="clear" w:color="auto" w:fill="F6F8FA"/>
+        <w:spacing w:before="40" w:after="40"/>
+        <w:rPr>
+          <w:rFonts w:ascii="Courier New" w:eastAsia="Courier New" w:hAnsi="Courier New" w:cs="Courier New"/>
+          <w:color w:val="0550AE"/>
+          <w:sz w:val="18"/>
+          <w:szCs w:val="18"/>
+        </w:rPr>
+      </w:pPr>
+      <w:r>
+        <w:rPr>
+          <w:rFonts w:ascii="Courier New" w:eastAsia="Courier New" w:hAnsi="Courier New" w:cs="Courier New"/>
+          <w:color w:val="0550AE"/>
+          <w:sz w:val="18"/>
+          <w:szCs w:val="18"/>
+        </w:rPr>
+        <w:t xml:space="preserve">Click </w:t>
+      </w:r>
+      <w:r>
+        <w:rPr>
+          <w:rFonts w:ascii="Courier New" w:eastAsia="Courier New" w:hAnsi="Courier New" w:cs="Courier New"/>
+          <w:b/>
+          <w:bCs/>
+          <w:color w:val="0550AE"/>
+          <w:sz w:val="18"/>
+          <w:szCs w:val="18"/>
+        </w:rPr>
+        <w:t>Create repository</w:t>
+      </w:r>
+    </w:p>
+    <w:p>
+      <w:pPr>
+        <w:shd w:val="clear" w:color="auto" w:fill="F6F8FA"/>
+        <w:spacing w:before="40" w:after="40"/>
+        <w:ind w:left="360"/>
+      </w:pPr>
+      <w:r>
+        <w:rPr>
+          <w:rFonts w:ascii="Courier New" w:eastAsia="Courier New" w:hAnsi="Courier New" w:cs="Courier New"/>
+          <w:color w:val="0550AE"/>
+          <w:sz w:val="18"/>
+          <w:szCs w:val="18"/>
+        </w:rPr>
+        <w:t>--------</w:t>
+      </w:r>
+      <w:r>
+        <w:rPr>
+          <w:rFonts w:ascii="Courier New" w:eastAsia="Courier New" w:hAnsi="Courier New" w:cs="Courier New"/>
+          <w:color w:val="0550AE"/>
+          <w:sz w:val="18"/>
+          <w:szCs w:val="18"/>
+        </w:rPr>
+        <w:br/>
+      </w:r>
+    </w:p>
+    <w:p>
+      <w:pPr>
+        <w:shd w:val="clear" w:color="auto" w:fill="F6F8FA"/>
+        <w:spacing w:before="40" w:after="40"/>
+        <w:ind w:left="360"/>
       </w:pPr>
       <w:r>
         <w:rPr>
@@ -3346,7 +4418,6 @@
         <w:pStyle w:val="Heading3"/>
       </w:pPr>
       <w:r>
-        <w:lastRenderedPageBreak/>
         <w:t>Subsequent Pushes</w:t>
       </w:r>
     </w:p>
@@ -3363,8 +4434,19 @@
           <w:sz w:val="18"/>
           <w:szCs w:val="18"/>
         </w:rPr>
-        <w:t>git add .</w:t>
-      </w:r>
+        <w:t xml:space="preserve">git </w:t>
+      </w:r>
+      <w:proofErr w:type="gramStart"/>
+      <w:r>
+        <w:rPr>
+          <w:rFonts w:ascii="Courier New" w:eastAsia="Courier New" w:hAnsi="Courier New" w:cs="Courier New"/>
+          <w:color w:val="0550AE"/>
+          <w:sz w:val="18"/>
+          <w:szCs w:val="18"/>
+        </w:rPr>
+        <w:t>add .</w:t>
+      </w:r>
+      <w:proofErr w:type="gramEnd"/>
     </w:p>
     <w:p>
       <w:pPr>
@@ -3445,26 +4527,172 @@
             <w:pPr>
               <w:spacing w:before="40" w:after="40"/>
             </w:pPr>
+            <w:proofErr w:type="gramStart"/>
             <w:r>
               <w:rPr>
                 <w:color w:val="7D4E00"/>
                 <w:sz w:val="20"/>
                 <w:szCs w:val="20"/>
               </w:rPr>
-              <w:t>⚠  terraform.tfvars, *.tfstate, *.pem, and *.ppk files are in .gitignore.</w:t>
+              <w:t>⚠</w:t>
+            </w:r>
+            <w:r>
+              <w:rPr>
+                <w:color w:val="7D4E00"/>
+                <w:sz w:val="20"/>
+                <w:szCs w:val="20"/>
+              </w:rPr>
+              <w:t xml:space="preserve">  </w:t>
+            </w:r>
+            <w:proofErr w:type="spellStart"/>
+            <w:r>
+              <w:rPr>
+                <w:color w:val="7D4E00"/>
+                <w:sz w:val="20"/>
+                <w:szCs w:val="20"/>
+              </w:rPr>
+              <w:t>terraform</w:t>
+            </w:r>
+            <w:proofErr w:type="gramEnd"/>
+            <w:r>
+              <w:rPr>
+                <w:color w:val="7D4E00"/>
+                <w:sz w:val="20"/>
+                <w:szCs w:val="20"/>
+              </w:rPr>
+              <w:t>.tfvars</w:t>
+            </w:r>
+            <w:proofErr w:type="spellEnd"/>
+            <w:r>
+              <w:rPr>
+                <w:color w:val="7D4E00"/>
+                <w:sz w:val="20"/>
+                <w:szCs w:val="20"/>
+              </w:rPr>
+              <w:t xml:space="preserve">, </w:t>
+            </w:r>
+            <w:proofErr w:type="gramStart"/>
+            <w:r>
+              <w:rPr>
+                <w:color w:val="7D4E00"/>
+                <w:sz w:val="20"/>
+                <w:szCs w:val="20"/>
+              </w:rPr>
+              <w:t>*.</w:t>
+            </w:r>
+            <w:proofErr w:type="spellStart"/>
+            <w:r>
+              <w:rPr>
+                <w:color w:val="7D4E00"/>
+                <w:sz w:val="20"/>
+                <w:szCs w:val="20"/>
+              </w:rPr>
+              <w:t>tfstate</w:t>
+            </w:r>
+            <w:proofErr w:type="spellEnd"/>
+            <w:proofErr w:type="gramEnd"/>
+            <w:r>
+              <w:rPr>
+                <w:color w:val="7D4E00"/>
+                <w:sz w:val="20"/>
+                <w:szCs w:val="20"/>
+              </w:rPr>
+              <w:t>, *.</w:t>
+            </w:r>
+            <w:proofErr w:type="spellStart"/>
+            <w:r>
+              <w:rPr>
+                <w:color w:val="7D4E00"/>
+                <w:sz w:val="20"/>
+                <w:szCs w:val="20"/>
+              </w:rPr>
+              <w:t>pem</w:t>
+            </w:r>
+            <w:proofErr w:type="spellEnd"/>
+            <w:r>
+              <w:rPr>
+                <w:color w:val="7D4E00"/>
+                <w:sz w:val="20"/>
+                <w:szCs w:val="20"/>
+              </w:rPr>
+              <w:t>, and *.</w:t>
+            </w:r>
+            <w:proofErr w:type="spellStart"/>
+            <w:r>
+              <w:rPr>
+                <w:color w:val="7D4E00"/>
+                <w:sz w:val="20"/>
+                <w:szCs w:val="20"/>
+              </w:rPr>
+              <w:t>ppk</w:t>
+            </w:r>
+            <w:proofErr w:type="spellEnd"/>
+            <w:r>
+              <w:rPr>
+                <w:color w:val="7D4E00"/>
+                <w:sz w:val="20"/>
+                <w:szCs w:val="20"/>
+              </w:rPr>
+              <w:t xml:space="preserve"> files are </w:t>
+            </w:r>
+            <w:proofErr w:type="gramStart"/>
+            <w:r>
+              <w:rPr>
+                <w:color w:val="7D4E00"/>
+                <w:sz w:val="20"/>
+                <w:szCs w:val="20"/>
+              </w:rPr>
+              <w:t>in .</w:t>
+            </w:r>
+            <w:proofErr w:type="spellStart"/>
+            <w:r>
+              <w:rPr>
+                <w:color w:val="7D4E00"/>
+                <w:sz w:val="20"/>
+                <w:szCs w:val="20"/>
+              </w:rPr>
+              <w:t>gitignore</w:t>
+            </w:r>
+            <w:proofErr w:type="spellEnd"/>
+            <w:proofErr w:type="gramEnd"/>
+            <w:r>
+              <w:rPr>
+                <w:color w:val="7D4E00"/>
+                <w:sz w:val="20"/>
+                <w:szCs w:val="20"/>
+              </w:rPr>
+              <w:t>.</w:t>
             </w:r>
           </w:p>
           <w:p>
             <w:pPr>
               <w:spacing w:before="40" w:after="40"/>
             </w:pPr>
+            <w:proofErr w:type="gramStart"/>
             <w:r>
               <w:rPr>
                 <w:color w:val="7D4E00"/>
                 <w:sz w:val="20"/>
                 <w:szCs w:val="20"/>
               </w:rPr>
-              <w:t>⚠  They will NOT be pushed to GitHub. Never commit credentials or state files.</w:t>
+              <w:t>⚠</w:t>
+            </w:r>
+            <w:r>
+              <w:rPr>
+                <w:color w:val="7D4E00"/>
+                <w:sz w:val="20"/>
+                <w:szCs w:val="20"/>
+              </w:rPr>
+              <w:t xml:space="preserve">  They</w:t>
+            </w:r>
+            <w:proofErr w:type="gramEnd"/>
+            <w:r>
+              <w:rPr>
+                <w:color w:val="7D4E00"/>
+                <w:sz w:val="20"/>
+                <w:szCs w:val="20"/>
+              </w:rPr>
+              <w:t xml:space="preserve"> will NOT be pushed to GitHub. Never commit credentials or state files.</w:t>
             </w:r>
           </w:p>
         </w:tc>
@@ -3621,6 +4849,7 @@
             </w:tcMar>
           </w:tcPr>
           <w:p>
+            <w:proofErr w:type="spellStart"/>
             <w:r>
               <w:rPr>
                 <w:color w:val="24292F"/>
@@ -3629,6 +4858,7 @@
               </w:rPr>
               <w:t>instance_id</w:t>
             </w:r>
+            <w:proofErr w:type="spellEnd"/>
           </w:p>
         </w:tc>
         <w:tc>
@@ -3704,6 +4934,7 @@
             </w:tcMar>
           </w:tcPr>
           <w:p>
+            <w:proofErr w:type="spellStart"/>
             <w:r>
               <w:rPr>
                 <w:color w:val="24292F"/>
@@ -3712,6 +4943,7 @@
               </w:rPr>
               <w:t>public_ip</w:t>
             </w:r>
+            <w:proofErr w:type="spellEnd"/>
           </w:p>
         </w:tc>
         <w:tc>
@@ -3787,6 +5019,7 @@
             </w:tcMar>
           </w:tcPr>
           <w:p>
+            <w:proofErr w:type="spellStart"/>
             <w:r>
               <w:rPr>
                 <w:color w:val="24292F"/>
@@ -3795,6 +5028,7 @@
               </w:rPr>
               <w:t>public_dns</w:t>
             </w:r>
+            <w:proofErr w:type="spellEnd"/>
           </w:p>
         </w:tc>
         <w:tc>
@@ -3870,6 +5104,7 @@
             </w:tcMar>
           </w:tcPr>
           <w:p>
+            <w:proofErr w:type="spellStart"/>
             <w:r>
               <w:rPr>
                 <w:color w:val="24292F"/>
@@ -3878,6 +5113,7 @@
               </w:rPr>
               <w:t>website_url</w:t>
             </w:r>
+            <w:proofErr w:type="spellEnd"/>
           </w:p>
         </w:tc>
         <w:tc>
@@ -3953,6 +5189,7 @@
             </w:tcMar>
           </w:tcPr>
           <w:p>
+            <w:proofErr w:type="spellStart"/>
             <w:r>
               <w:rPr>
                 <w:color w:val="24292F"/>
@@ -3961,6 +5198,7 @@
               </w:rPr>
               <w:t>ssh_command</w:t>
             </w:r>
+            <w:proofErr w:type="spellEnd"/>
           </w:p>
         </w:tc>
         <w:tc>
@@ -4013,7 +5251,43 @@
                 <w:sz w:val="20"/>
                 <w:szCs w:val="20"/>
               </w:rPr>
-              <w:t>ssh -i key.pem ec2-user@54.123.45.67</w:t>
+              <w:t>ssh -</w:t>
+            </w:r>
+            <w:proofErr w:type="spellStart"/>
+            <w:r>
+              <w:rPr>
+                <w:color w:val="24292F"/>
+                <w:sz w:val="20"/>
+                <w:szCs w:val="20"/>
+              </w:rPr>
+              <w:t>i</w:t>
+            </w:r>
+            <w:proofErr w:type="spellEnd"/>
+            <w:r>
+              <w:rPr>
+                <w:color w:val="24292F"/>
+                <w:sz w:val="20"/>
+                <w:szCs w:val="20"/>
+              </w:rPr>
+              <w:t xml:space="preserve"> </w:t>
+            </w:r>
+            <w:proofErr w:type="spellStart"/>
+            <w:r>
+              <w:rPr>
+                <w:color w:val="24292F"/>
+                <w:sz w:val="20"/>
+                <w:szCs w:val="20"/>
+              </w:rPr>
+              <w:t>key.pem</w:t>
+            </w:r>
+            <w:proofErr w:type="spellEnd"/>
+            <w:r>
+              <w:rPr>
+                <w:color w:val="24292F"/>
+                <w:sz w:val="20"/>
+                <w:szCs w:val="20"/>
+              </w:rPr>
+              <w:t xml:space="preserve"> ec2-user@54.123.45.67</w:t>
             </w:r>
           </w:p>
         </w:tc>
@@ -4064,7 +5338,27 @@
           <w:sz w:val="18"/>
           <w:szCs w:val="18"/>
         </w:rPr>
-        <w:t>terraform output public_ip    # Single value</w:t>
+        <w:t xml:space="preserve">terraform output </w:t>
+      </w:r>
+      <w:proofErr w:type="spellStart"/>
+      <w:r>
+        <w:rPr>
+          <w:rFonts w:ascii="Courier New" w:eastAsia="Courier New" w:hAnsi="Courier New" w:cs="Courier New"/>
+          <w:color w:val="0550AE"/>
+          <w:sz w:val="18"/>
+          <w:szCs w:val="18"/>
+        </w:rPr>
+        <w:t>public_ip</w:t>
+      </w:r>
+      <w:proofErr w:type="spellEnd"/>
+      <w:r>
+        <w:rPr>
+          <w:rFonts w:ascii="Courier New" w:eastAsia="Courier New" w:hAnsi="Courier New" w:cs="Courier New"/>
+          <w:color w:val="0550AE"/>
+          <w:sz w:val="18"/>
+          <w:szCs w:val="18"/>
+        </w:rPr>
+        <w:t xml:space="preserve">    # Single value</w:t>
       </w:r>
     </w:p>
     <w:p>
@@ -4278,7 +5572,25 @@
                 <w:sz w:val="20"/>
                 <w:szCs w:val="20"/>
               </w:rPr>
-              <w:t>terraform init fails</w:t>
+              <w:t xml:space="preserve">terraform </w:t>
+            </w:r>
+            <w:proofErr w:type="spellStart"/>
+            <w:r>
+              <w:rPr>
+                <w:color w:val="24292F"/>
+                <w:sz w:val="20"/>
+                <w:szCs w:val="20"/>
+              </w:rPr>
+              <w:t>init</w:t>
+            </w:r>
+            <w:proofErr w:type="spellEnd"/>
+            <w:r>
+              <w:rPr>
+                <w:color w:val="24292F"/>
+                <w:sz w:val="20"/>
+                <w:szCs w:val="20"/>
+              </w:rPr>
+              <w:t xml:space="preserve"> fails</w:t>
             </w:r>
           </w:p>
         </w:tc>
@@ -4332,7 +5644,25 @@
                 <w:sz w:val="20"/>
                 <w:szCs w:val="20"/>
               </w:rPr>
-              <w:t>Check connection; verify required_providers block</w:t>
+              <w:t xml:space="preserve">Check connection; verify </w:t>
+            </w:r>
+            <w:proofErr w:type="spellStart"/>
+            <w:r>
+              <w:rPr>
+                <w:color w:val="24292F"/>
+                <w:sz w:val="20"/>
+                <w:szCs w:val="20"/>
+              </w:rPr>
+              <w:t>required_providers</w:t>
+            </w:r>
+            <w:proofErr w:type="spellEnd"/>
+            <w:r>
+              <w:rPr>
+                <w:color w:val="24292F"/>
+                <w:sz w:val="20"/>
+                <w:szCs w:val="20"/>
+              </w:rPr>
+              <w:t xml:space="preserve"> block</w:t>
             </w:r>
           </w:p>
         </w:tc>
@@ -4415,7 +5745,25 @@
                 <w:sz w:val="20"/>
                 <w:szCs w:val="20"/>
               </w:rPr>
-              <w:t>Run aws configure</w:t>
+              <w:t xml:space="preserve">Run </w:t>
+            </w:r>
+            <w:proofErr w:type="spellStart"/>
+            <w:r>
+              <w:rPr>
+                <w:color w:val="24292F"/>
+                <w:sz w:val="20"/>
+                <w:szCs w:val="20"/>
+              </w:rPr>
+              <w:t>aws</w:t>
+            </w:r>
+            <w:proofErr w:type="spellEnd"/>
+            <w:r>
+              <w:rPr>
+                <w:color w:val="24292F"/>
+                <w:sz w:val="20"/>
+                <w:szCs w:val="20"/>
+              </w:rPr>
+              <w:t xml:space="preserve"> configure</w:t>
             </w:r>
           </w:p>
         </w:tc>
@@ -4438,15 +5786,16 @@
             </w:tcMar>
           </w:tcPr>
           <w:p>
-            <w:r>
-              <w:rPr>
-                <w:color w:val="24292F"/>
-                <w:sz w:val="20"/>
-                <w:szCs w:val="20"/>
-              </w:rPr>
-              <w:lastRenderedPageBreak/>
+            <w:proofErr w:type="spellStart"/>
+            <w:r>
+              <w:rPr>
+                <w:color w:val="24292F"/>
+                <w:sz w:val="20"/>
+                <w:szCs w:val="20"/>
+              </w:rPr>
               <w:t>InvalidKeyPair.NotFound</w:t>
             </w:r>
+            <w:proofErr w:type="spellEnd"/>
           </w:p>
         </w:tc>
         <w:tc>
@@ -4472,8 +5821,18 @@
                 <w:sz w:val="20"/>
                 <w:szCs w:val="20"/>
               </w:rPr>
-              <w:t>Wrong key pair name in tfvars</w:t>
-            </w:r>
+              <w:t xml:space="preserve">Wrong key pair name in </w:t>
+            </w:r>
+            <w:proofErr w:type="spellStart"/>
+            <w:r>
+              <w:rPr>
+                <w:color w:val="24292F"/>
+                <w:sz w:val="20"/>
+                <w:szCs w:val="20"/>
+              </w:rPr>
+              <w:t>tfvars</w:t>
+            </w:r>
+            <w:proofErr w:type="spellEnd"/>
           </w:p>
         </w:tc>
         <w:tc>
@@ -4528,8 +5887,18 @@
                 <w:sz w:val="20"/>
                 <w:szCs w:val="20"/>
               </w:rPr>
-              <w:t>Page doesn't load after apply</w:t>
-            </w:r>
+              <w:t xml:space="preserve">Page doesn't load after </w:t>
+            </w:r>
+            <w:proofErr w:type="gramStart"/>
+            <w:r>
+              <w:rPr>
+                <w:color w:val="24292F"/>
+                <w:sz w:val="20"/>
+                <w:szCs w:val="20"/>
+              </w:rPr>
+              <w:t>apply</w:t>
+            </w:r>
+            <w:proofErr w:type="gramEnd"/>
           </w:p>
         </w:tc>
         <w:tc>
@@ -4632,13 +6001,33 @@
             </w:tcMar>
           </w:tcPr>
           <w:p>
-            <w:r>
-              <w:rPr>
-                <w:color w:val="24292F"/>
-                <w:sz w:val="20"/>
-                <w:szCs w:val="20"/>
-              </w:rPr>
-              <w:t>Wrong .ppk or wrong username</w:t>
+            <w:proofErr w:type="gramStart"/>
+            <w:r>
+              <w:rPr>
+                <w:color w:val="24292F"/>
+                <w:sz w:val="20"/>
+                <w:szCs w:val="20"/>
+              </w:rPr>
+              <w:t>Wrong .</w:t>
+            </w:r>
+            <w:proofErr w:type="spellStart"/>
+            <w:r>
+              <w:rPr>
+                <w:color w:val="24292F"/>
+                <w:sz w:val="20"/>
+                <w:szCs w:val="20"/>
+              </w:rPr>
+              <w:t>ppk</w:t>
+            </w:r>
+            <w:proofErr w:type="spellEnd"/>
+            <w:proofErr w:type="gramEnd"/>
+            <w:r>
+              <w:rPr>
+                <w:color w:val="24292F"/>
+                <w:sz w:val="20"/>
+                <w:szCs w:val="20"/>
+              </w:rPr>
+              <w:t xml:space="preserve"> or wrong username</w:t>
             </w:r>
           </w:p>
         </w:tc>
@@ -4665,7 +6054,35 @@
                 <w:sz w:val="20"/>
                 <w:szCs w:val="20"/>
               </w:rPr>
-              <w:t>Use ec2-user; verify .ppk matches the key pair</w:t>
+              <w:t xml:space="preserve">Use ec2-user; </w:t>
+            </w:r>
+            <w:proofErr w:type="gramStart"/>
+            <w:r>
+              <w:rPr>
+                <w:color w:val="24292F"/>
+                <w:sz w:val="20"/>
+                <w:szCs w:val="20"/>
+              </w:rPr>
+              <w:t>verify .</w:t>
+            </w:r>
+            <w:proofErr w:type="spellStart"/>
+            <w:r>
+              <w:rPr>
+                <w:color w:val="24292F"/>
+                <w:sz w:val="20"/>
+                <w:szCs w:val="20"/>
+              </w:rPr>
+              <w:t>ppk</w:t>
+            </w:r>
+            <w:proofErr w:type="spellEnd"/>
+            <w:proofErr w:type="gramEnd"/>
+            <w:r>
+              <w:rPr>
+                <w:color w:val="24292F"/>
+                <w:sz w:val="20"/>
+                <w:szCs w:val="20"/>
+              </w:rPr>
+              <w:t xml:space="preserve"> matches the key pair</w:t>
             </w:r>
           </w:p>
         </w:tc>
@@ -4748,7 +6165,43 @@
                 <w:sz w:val="20"/>
                 <w:szCs w:val="20"/>
               </w:rPr>
-              <w:t>SSH in, run: sudo systemctl status httpd</w:t>
+              <w:t xml:space="preserve">SSH in, run: </w:t>
+            </w:r>
+            <w:proofErr w:type="spellStart"/>
+            <w:r>
+              <w:rPr>
+                <w:color w:val="24292F"/>
+                <w:sz w:val="20"/>
+                <w:szCs w:val="20"/>
+              </w:rPr>
+              <w:t>sudo</w:t>
+            </w:r>
+            <w:proofErr w:type="spellEnd"/>
+            <w:r>
+              <w:rPr>
+                <w:color w:val="24292F"/>
+                <w:sz w:val="20"/>
+                <w:szCs w:val="20"/>
+              </w:rPr>
+              <w:t xml:space="preserve"> </w:t>
+            </w:r>
+            <w:proofErr w:type="spellStart"/>
+            <w:r>
+              <w:rPr>
+                <w:color w:val="24292F"/>
+                <w:sz w:val="20"/>
+                <w:szCs w:val="20"/>
+              </w:rPr>
+              <w:t>systemctl</w:t>
+            </w:r>
+            <w:proofErr w:type="spellEnd"/>
+            <w:r>
+              <w:rPr>
+                <w:color w:val="24292F"/>
+                <w:sz w:val="20"/>
+                <w:szCs w:val="20"/>
+              </w:rPr>
+              <w:t xml:space="preserve"> status httpd</w:t>
             </w:r>
           </w:p>
         </w:tc>
@@ -4889,8 +6342,13 @@
         <w:spacing w:before="40" w:after="40"/>
       </w:pPr>
       <w:r>
-        <w:t xml:space="preserve"> Set the server hostname to Myfirstwebserver</w:t>
-      </w:r>
+        <w:t xml:space="preserve"> Set the server hostname to </w:t>
+      </w:r>
+      <w:proofErr w:type="spellStart"/>
+      <w:r>
+        <w:t>Myfirstwebserver</w:t>
+      </w:r>
+      <w:proofErr w:type="spellEnd"/>
     </w:p>
     <w:p>
       <w:pPr>
@@ -4902,7 +6360,15 @@
         <w:spacing w:before="40" w:after="40"/>
       </w:pPr>
       <w:r>
-        <w:t xml:space="preserve"> Display custom webpage: "Hello from Myfirstwebserver"</w:t>
+        <w:t xml:space="preserve"> Display custom webpage: "Hello from </w:t>
+      </w:r>
+      <w:proofErr w:type="spellStart"/>
+      <w:r>
+        <w:t>Myfirstwebserver</w:t>
+      </w:r>
+      <w:proofErr w:type="spellEnd"/>
+      <w:r>
+        <w:t>"</w:t>
       </w:r>
     </w:p>
     <w:p>
@@ -5010,7 +6476,7 @@
         <w:sz w:val="18"/>
         <w:szCs w:val="18"/>
       </w:rPr>
-      <w:t>Lab Exercise — Terraform on AWS</w:t>
+      <w:t>By Sylvain S. Kamdem</w:t>
     </w:r>
     <w:r>
       <w:rPr>
@@ -5211,6 +6677,119 @@
     </w:lvl>
   </w:abstractNum>
   <w:abstractNum w:abstractNumId="1" w15:restartNumberingAfterBreak="0">
+    <w:nsid w:val="30A729E7"/>
+    <w:multiLevelType w:val="multilevel"/>
+    <w:tmpl w:val="8B722F2E"/>
+    <w:lvl w:ilvl="0">
+      <w:start w:val="1"/>
+      <w:numFmt w:val="decimal"/>
+      <w:lvlText w:val="%1."/>
+      <w:lvlJc w:val="left"/>
+      <w:pPr>
+        <w:tabs>
+          <w:tab w:val="num" w:pos="720"/>
+        </w:tabs>
+        <w:ind w:left="720" w:hanging="360"/>
+      </w:pPr>
+    </w:lvl>
+    <w:lvl w:ilvl="1" w:tentative="1">
+      <w:start w:val="1"/>
+      <w:numFmt w:val="decimal"/>
+      <w:lvlText w:val="%2."/>
+      <w:lvlJc w:val="left"/>
+      <w:pPr>
+        <w:tabs>
+          <w:tab w:val="num" w:pos="1440"/>
+        </w:tabs>
+        <w:ind w:left="1440" w:hanging="360"/>
+      </w:pPr>
+    </w:lvl>
+    <w:lvl w:ilvl="2" w:tentative="1">
+      <w:start w:val="1"/>
+      <w:numFmt w:val="decimal"/>
+      <w:lvlText w:val="%3."/>
+      <w:lvlJc w:val="left"/>
+      <w:pPr>
+        <w:tabs>
+          <w:tab w:val="num" w:pos="2160"/>
+        </w:tabs>
+        <w:ind w:left="2160" w:hanging="360"/>
+      </w:pPr>
+    </w:lvl>
+    <w:lvl w:ilvl="3" w:tentative="1">
+      <w:start w:val="1"/>
+      <w:numFmt w:val="decimal"/>
+      <w:lvlText w:val="%4."/>
+      <w:lvlJc w:val="left"/>
+      <w:pPr>
+        <w:tabs>
+          <w:tab w:val="num" w:pos="2880"/>
+        </w:tabs>
+        <w:ind w:left="2880" w:hanging="360"/>
+      </w:pPr>
+    </w:lvl>
+    <w:lvl w:ilvl="4" w:tentative="1">
+      <w:start w:val="1"/>
+      <w:numFmt w:val="decimal"/>
+      <w:lvlText w:val="%5."/>
+      <w:lvlJc w:val="left"/>
+      <w:pPr>
+        <w:tabs>
+          <w:tab w:val="num" w:pos="3600"/>
+        </w:tabs>
+        <w:ind w:left="3600" w:hanging="360"/>
+      </w:pPr>
+    </w:lvl>
+    <w:lvl w:ilvl="5" w:tentative="1">
+      <w:start w:val="1"/>
+      <w:numFmt w:val="decimal"/>
+      <w:lvlText w:val="%6."/>
+      <w:lvlJc w:val="left"/>
+      <w:pPr>
+        <w:tabs>
+          <w:tab w:val="num" w:pos="4320"/>
+        </w:tabs>
+        <w:ind w:left="4320" w:hanging="360"/>
+      </w:pPr>
+    </w:lvl>
+    <w:lvl w:ilvl="6" w:tentative="1">
+      <w:start w:val="1"/>
+      <w:numFmt w:val="decimal"/>
+      <w:lvlText w:val="%7."/>
+      <w:lvlJc w:val="left"/>
+      <w:pPr>
+        <w:tabs>
+          <w:tab w:val="num" w:pos="5040"/>
+        </w:tabs>
+        <w:ind w:left="5040" w:hanging="360"/>
+      </w:pPr>
+    </w:lvl>
+    <w:lvl w:ilvl="7" w:tentative="1">
+      <w:start w:val="1"/>
+      <w:numFmt w:val="decimal"/>
+      <w:lvlText w:val="%8."/>
+      <w:lvlJc w:val="left"/>
+      <w:pPr>
+        <w:tabs>
+          <w:tab w:val="num" w:pos="5760"/>
+        </w:tabs>
+        <w:ind w:left="5760" w:hanging="360"/>
+      </w:pPr>
+    </w:lvl>
+    <w:lvl w:ilvl="8" w:tentative="1">
+      <w:start w:val="1"/>
+      <w:numFmt w:val="decimal"/>
+      <w:lvlText w:val="%9."/>
+      <w:lvlJc w:val="left"/>
+      <w:pPr>
+        <w:tabs>
+          <w:tab w:val="num" w:pos="6480"/>
+        </w:tabs>
+        <w:ind w:left="6480" w:hanging="360"/>
+      </w:pPr>
+    </w:lvl>
+  </w:abstractNum>
+  <w:abstractNum w:abstractNumId="2" w15:restartNumberingAfterBreak="0">
     <w:nsid w:val="31997CA7"/>
     <w:multiLevelType w:val="hybridMultilevel"/>
     <w:tmpl w:val="B7B8BC5C"/>
@@ -5264,7 +6843,7 @@
       <w:lvlJc w:val="left"/>
     </w:lvl>
   </w:abstractNum>
-  <w:abstractNum w:abstractNumId="2" w15:restartNumberingAfterBreak="0">
+  <w:abstractNum w:abstractNumId="3" w15:restartNumberingAfterBreak="0">
     <w:nsid w:val="5AD60EB2"/>
     <w:multiLevelType w:val="hybridMultilevel"/>
     <w:tmpl w:val="E5F2034E"/>
@@ -5318,7 +6897,7 @@
       <w:lvlJc w:val="left"/>
     </w:lvl>
   </w:abstractNum>
-  <w:abstractNum w:abstractNumId="3" w15:restartNumberingAfterBreak="0">
+  <w:abstractNum w:abstractNumId="4" w15:restartNumberingAfterBreak="0">
     <w:nsid w:val="641A0076"/>
     <w:multiLevelType w:val="hybridMultilevel"/>
     <w:tmpl w:val="50064F2E"/>
@@ -5405,7 +6984,7 @@
     </w:lvl>
   </w:abstractNum>
   <w:num w:numId="1" w16cid:durableId="786705553">
-    <w:abstractNumId w:val="3"/>
+    <w:abstractNumId w:val="4"/>
     <w:lvlOverride w:ilvl="0">
       <w:startOverride w:val="1"/>
     </w:lvlOverride>
@@ -5417,16 +6996,19 @@
     </w:lvlOverride>
   </w:num>
   <w:num w:numId="3" w16cid:durableId="412246103">
+    <w:abstractNumId w:val="3"/>
+    <w:lvlOverride w:ilvl="0">
+      <w:startOverride w:val="1"/>
+    </w:lvlOverride>
+  </w:num>
+  <w:num w:numId="4" w16cid:durableId="1271356969">
     <w:abstractNumId w:val="2"/>
     <w:lvlOverride w:ilvl="0">
       <w:startOverride w:val="1"/>
     </w:lvlOverride>
   </w:num>
-  <w:num w:numId="4" w16cid:durableId="1271356969">
+  <w:num w:numId="5" w16cid:durableId="1120492769">
     <w:abstractNumId w:val="1"/>
-    <w:lvlOverride w:ilvl="0">
-      <w:startOverride w:val="1"/>
-    </w:lvlOverride>
   </w:num>
 </w:numbering>
 </file>
@@ -5920,7 +7502,6 @@
   <w:style w:type="character" w:default="1" w:styleId="DefaultParagraphFont">
     <w:name w:val="Default Paragraph Font"/>
     <w:uiPriority w:val="1"/>
-    <w:semiHidden/>
     <w:unhideWhenUsed/>
   </w:style>
   <w:style w:type="table" w:default="1" w:styleId="TableNormal">
@@ -6016,6 +7597,48 @@
       <w:color w:val="605E5C"/>
       <w:shd w:val="clear" w:color="auto" w:fill="E1DFDD"/>
     </w:rPr>
+  </w:style>
+  <w:style w:type="paragraph" w:styleId="Header">
+    <w:name w:val="header"/>
+    <w:basedOn w:val="Normal"/>
+    <w:link w:val="HeaderChar"/>
+    <w:uiPriority w:val="99"/>
+    <w:unhideWhenUsed/>
+    <w:rsid w:val="00A37D2C"/>
+    <w:pPr>
+      <w:tabs>
+        <w:tab w:val="center" w:pos="4680"/>
+        <w:tab w:val="right" w:pos="9360"/>
+      </w:tabs>
+    </w:pPr>
+  </w:style>
+  <w:style w:type="character" w:customStyle="1" w:styleId="HeaderChar">
+    <w:name w:val="Header Char"/>
+    <w:basedOn w:val="DefaultParagraphFont"/>
+    <w:link w:val="Header"/>
+    <w:uiPriority w:val="99"/>
+    <w:rsid w:val="00A37D2C"/>
+  </w:style>
+  <w:style w:type="paragraph" w:styleId="Footer">
+    <w:name w:val="footer"/>
+    <w:basedOn w:val="Normal"/>
+    <w:link w:val="FooterChar"/>
+    <w:uiPriority w:val="99"/>
+    <w:unhideWhenUsed/>
+    <w:rsid w:val="00A37D2C"/>
+    <w:pPr>
+      <w:tabs>
+        <w:tab w:val="center" w:pos="4680"/>
+        <w:tab w:val="right" w:pos="9360"/>
+      </w:tabs>
+    </w:pPr>
+  </w:style>
+  <w:style w:type="character" w:customStyle="1" w:styleId="FooterChar">
+    <w:name w:val="Footer Char"/>
+    <w:basedOn w:val="DefaultParagraphFont"/>
+    <w:link w:val="Footer"/>
+    <w:uiPriority w:val="99"/>
+    <w:rsid w:val="00A37D2C"/>
   </w:style>
 </w:styles>
 </file>

</xml_diff>